<commit_message>
Fixed Error on GDD
</commit_message>
<xml_diff>
--- a/RE-CODE_GDD_v2.0(ClaudeSonnet4.6).docx
+++ b/RE-CODE_GDD_v2.0(ClaudeSonnet4.6).docx
@@ -1515,7 +1515,67 @@
           <w:szCs w:val="22"/>
           <w:lang w:val="en-GB"/>
         </w:rPr>
-        <w:t>Manipulation — The player holds [A] to open the Radial Menu, selects the desired Tag from the Hub Buffer with the mouse, then applies it to a Container object by pressing [E]. Focus Mode ([F]) can be activated independently at any time to highlight interactable objects and better read the environment.</w:t>
+        <w:t>Manipulation — The player holds [A] to open the Radial Menu, selects the desired Tag from the Hub Buffer with the mouse, then applies it to a Container object by pressing [E]</w:t>
+      </w:r>
+      <w:r>
+        <w:rPr>
+          <w:sz w:val="22"/>
+          <w:szCs w:val="22"/>
+          <w:lang w:val="en-GB"/>
+        </w:rPr>
+        <w:t xml:space="preserve">, when he does </w:t>
+      </w:r>
+      <w:proofErr w:type="gramStart"/>
+      <w:r>
+        <w:rPr>
+          <w:sz w:val="22"/>
+          <w:szCs w:val="22"/>
+          <w:lang w:val="en-GB"/>
+        </w:rPr>
+        <w:t>that</w:t>
+      </w:r>
+      <w:proofErr w:type="gramEnd"/>
+      <w:r>
+        <w:rPr>
+          <w:sz w:val="22"/>
+          <w:szCs w:val="22"/>
+          <w:lang w:val="en-GB"/>
+        </w:rPr>
+        <w:t xml:space="preserve"> the tag </w:t>
+      </w:r>
+      <w:proofErr w:type="gramStart"/>
+      <w:r>
+        <w:rPr>
+          <w:sz w:val="22"/>
+          <w:szCs w:val="22"/>
+          <w:lang w:val="en-GB"/>
+        </w:rPr>
+        <w:t>disappear</w:t>
+      </w:r>
+      <w:proofErr w:type="gramEnd"/>
+      <w:r>
+        <w:rPr>
+          <w:sz w:val="22"/>
+          <w:szCs w:val="22"/>
+          <w:lang w:val="en-GB"/>
+        </w:rPr>
+        <w:t xml:space="preserve"> from the </w:t>
+      </w:r>
+      <w:r>
+        <w:rPr>
+          <w:sz w:val="22"/>
+          <w:szCs w:val="22"/>
+          <w:lang w:val="en-GB"/>
+        </w:rPr>
+        <w:t>Hub Buffer</w:t>
+      </w:r>
+      <w:r>
+        <w:rPr>
+          <w:sz w:val="22"/>
+          <w:szCs w:val="22"/>
+          <w:lang w:val="en-GB"/>
+        </w:rPr>
+        <w:t>. Focus Mode ([F]) can be activated independently at any time to highlight interactable objects and better read the environment.</w:t>
       </w:r>
     </w:p>
     <w:p>
@@ -1689,7 +1749,41 @@
           <w:szCs w:val="22"/>
           <w:lang w:val="en-GB"/>
         </w:rPr>
-        <w:t>Tag application: press [E] to apply the selected Tag to the targeted Container object.</w:t>
+        <w:t>Tag application: press [E] to apply the selected Tag to the targeted Container object</w:t>
+      </w:r>
+      <w:r>
+        <w:rPr>
+          <w:sz w:val="22"/>
+          <w:szCs w:val="22"/>
+          <w:lang w:val="en-GB"/>
+        </w:rPr>
+        <w:t xml:space="preserve">, when this </w:t>
+      </w:r>
+      <w:proofErr w:type="gramStart"/>
+      <w:r>
+        <w:rPr>
+          <w:sz w:val="22"/>
+          <w:szCs w:val="22"/>
+          <w:lang w:val="en-GB"/>
+        </w:rPr>
+        <w:t>happen</w:t>
+      </w:r>
+      <w:proofErr w:type="gramEnd"/>
+      <w:r>
+        <w:rPr>
+          <w:sz w:val="22"/>
+          <w:szCs w:val="22"/>
+          <w:lang w:val="en-GB"/>
+        </w:rPr>
+        <w:t xml:space="preserve"> the Tag disappear from the Hub Buffer</w:t>
+      </w:r>
+      <w:r>
+        <w:rPr>
+          <w:sz w:val="22"/>
+          <w:szCs w:val="22"/>
+          <w:lang w:val="en-GB"/>
+        </w:rPr>
+        <w:t>.</w:t>
       </w:r>
     </w:p>
     <w:p>
@@ -1774,6 +1868,27 @@
     </w:p>
     <w:p>
       <w:pPr>
+        <w:pStyle w:val="Paragrafoelenco"/>
+        <w:numPr>
+          <w:ilvl w:val="0"/>
+          <w:numId w:val="2"/>
+        </w:numPr>
+        <w:spacing w:after="80"/>
+        <w:rPr>
+          <w:lang w:val="en-GB"/>
+        </w:rPr>
+      </w:pPr>
+      <w:r>
+        <w:rPr>
+          <w:sz w:val="22"/>
+          <w:szCs w:val="22"/>
+          <w:lang w:val="en-GB"/>
+        </w:rPr>
+        <w:t>When a Tag is applied is removed from the Hub Buffer</w:t>
+      </w:r>
+    </w:p>
+    <w:p>
+      <w:pPr>
         <w:spacing w:after="80"/>
         <w:rPr>
           <w:lang w:val="en-GB"/>
@@ -1806,7 +1921,14 @@
         <w:rPr>
           <w:lang w:val="en-GB"/>
         </w:rPr>
-        <w:t>Focus Mode is an optional visual aid activated by pressing [F]. It is completely independent of tag extraction and application: the player can interact with the game world without ever using Focus Mode. When active, the environment desaturates and all interactable objects (Sources, Containers, Terminals) are highlighted with cyan outlines and holographic tag labels, with visible data flows between connected objects. This allows the player to quickly read the puzzle state and identify which objects can be manipulated. The background music changes dynamically while Focus Mode is active and returns to the level track when deactivated.</w:t>
+        <w:t xml:space="preserve">Focus Mode is an optional visual aid activated by pressing [F]. It is completely independent of tag extraction and application: the player can interact with the game world without ever using Focus Mode. When active, the environment desaturates and all interactable objects (Sources, Containers, Terminals) are highlighted with cyan outlines and holographic tag labels, with visible data flows between connected </w:t>
+      </w:r>
+      <w:r>
+        <w:rPr>
+          <w:lang w:val="en-GB"/>
+        </w:rPr>
+        <w:lastRenderedPageBreak/>
+        <w:t>objects. This allows the player to quickly read the puzzle state and identify which objects can be manipulated. The background music changes dynamically while Focus Mode is active and returns to the level track when deactivated.</w:t>
       </w:r>
     </w:p>
     <w:p>
@@ -1821,7 +1943,6 @@
         <w:rPr>
           <w:lang w:val="en-GB"/>
         </w:rPr>
-        <w:lastRenderedPageBreak/>
         <w:t>5.5 TILT System</w:t>
       </w:r>
     </w:p>
@@ -1834,7 +1955,21 @@
           <w:color w:val="000000"/>
           <w:lang w:val="en-GB"/>
         </w:rPr>
-        <w:t xml:space="preserve">When a player attempts to apply a Tag that is semantically incompatible with a Tag already present on an object, the TILT System activates. The affected Tags are cleared from the object and returned to their originating Source terminals — this is a permanent design decision. Visual feedback is delivered via a HUD-based alert. An error sound plays. </w:t>
+        <w:t>When a player attempts to apply a Tag that is semantically incompatible with a Tag already present on an object, the TILT System activates. The affected Tags are cleared from the object</w:t>
+      </w:r>
+      <w:r>
+        <w:rPr>
+          <w:color w:val="000000"/>
+          <w:lang w:val="en-GB"/>
+        </w:rPr>
+        <w:t xml:space="preserve"> </w:t>
+      </w:r>
+      <w:r>
+        <w:rPr>
+          <w:color w:val="000000"/>
+          <w:lang w:val="en-GB"/>
+        </w:rPr>
+        <w:t xml:space="preserve">— this is a permanent design decision. Visual feedback is delivered via a HUD-based alert. An error sound plays. </w:t>
       </w:r>
       <w:r>
         <w:rPr>
@@ -2881,6 +3016,7 @@
                 <w:sz w:val="20"/>
                 <w:szCs w:val="20"/>
               </w:rPr>
+              <w:lastRenderedPageBreak/>
               <w:t>[GHOST]</w:t>
             </w:r>
           </w:p>
@@ -3185,7 +3321,6 @@
         <w:spacing w:before="300"/>
       </w:pPr>
       <w:r>
-        <w:lastRenderedPageBreak/>
         <w:t>6.2 Extended Tags</w:t>
       </w:r>
     </w:p>
@@ -5478,6 +5613,7 @@
         <w:spacing w:before="300"/>
       </w:pPr>
       <w:r>
+        <w:lastRenderedPageBreak/>
         <w:t>6.4 Special Combos</w:t>
       </w:r>
     </w:p>
@@ -5739,7 +5875,6 @@
                 <w:sz w:val="20"/>
                 <w:szCs w:val="20"/>
               </w:rPr>
-              <w:lastRenderedPageBreak/>
               <w:t>[LIGHT] + [REPULSIVE]</w:t>
             </w:r>
           </w:p>
@@ -12641,7 +12776,6 @@
           <w:color w:val="000000"/>
           <w:lang w:val="en-GB"/>
         </w:rPr>
-        <w:lastRenderedPageBreak/>
         <w:t>Elements that do not accept Tags but react to them: pressure plates, magnetic switches, doors. They cannot be tagged directly.</w:t>
       </w:r>
     </w:p>
@@ -12978,7 +13112,6 @@
           <w:szCs w:val="22"/>
           <w:lang w:val="en-GB"/>
         </w:rPr>
-        <w:lastRenderedPageBreak/>
         <w:t>Dynamic crosshair: changes shape when hovering over interactable objects (Source, Container, Terminal).</w:t>
       </w:r>
     </w:p>
@@ -13513,6 +13646,7 @@
                 <w:sz w:val="20"/>
                 <w:szCs w:val="20"/>
               </w:rPr>
+              <w:lastRenderedPageBreak/>
               <w:t>Reset 1</w:t>
             </w:r>
           </w:p>
@@ -13649,7 +13783,6 @@
                 <w:sz w:val="20"/>
                 <w:szCs w:val="20"/>
               </w:rPr>
-              <w:lastRenderedPageBreak/>
               <w:t>Reset 3+</w:t>
             </w:r>
           </w:p>
@@ -14682,6 +14815,7 @@
         <w:rPr>
           <w:lang w:val="en-GB"/>
         </w:rPr>
+        <w:lastRenderedPageBreak/>
         <w:t>Level 3 — SECTOR 03: Interference</w:t>
       </w:r>
     </w:p>
@@ -14712,7 +14846,6 @@
           <w:color w:val="000000"/>
           <w:lang w:val="en-GB"/>
         </w:rPr>
-        <w:lastRenderedPageBreak/>
         <w:t>Structure: A large main room, a hidden lateral corridor (accessible via the grate), and a Compilation room.</w:t>
       </w:r>
     </w:p>
@@ -14928,7 +15061,21 @@
           <w:color w:val="000000"/>
           <w:lang w:val="en-GB"/>
         </w:rPr>
-        <w:t>TILT discovery: If the player applies [LIGHT] and [HEAVY] to the same object, the TILT triggers for the first time. The HUD alert activates, both tags return to their Source terminals, and Echo comments.</w:t>
+        <w:t>TILT discovery: If the player applies [LIGHT] and [HEAVY] to the same object, the TILT triggers for the first time. The HUD alert activates, both tags</w:t>
+      </w:r>
+      <w:r>
+        <w:rPr>
+          <w:color w:val="000000"/>
+          <w:lang w:val="en-GB"/>
+        </w:rPr>
+        <w:t xml:space="preserve"> are cleared from the object</w:t>
+      </w:r>
+      <w:r>
+        <w:rPr>
+          <w:color w:val="000000"/>
+          <w:lang w:val="en-GB"/>
+        </w:rPr>
+        <w:t>, and Echo comments.</w:t>
       </w:r>
     </w:p>
     <w:p>
@@ -15607,6 +15754,7 @@
         <w:spacing w:before="300"/>
       </w:pPr>
       <w:r>
+        <w:lastRenderedPageBreak/>
         <w:t>Music</w:t>
       </w:r>
     </w:p>
@@ -15622,24 +15770,7 @@
           <w:color w:val="000000"/>
           <w:lang w:val="en-GB"/>
         </w:rPr>
-        <w:lastRenderedPageBreak/>
-        <w:t xml:space="preserve">Style: Dark Ambient / Minimal </w:t>
-      </w:r>
-      <w:proofErr w:type="spellStart"/>
-      <w:r>
-        <w:rPr>
-          <w:color w:val="000000"/>
-          <w:lang w:val="en-GB"/>
-        </w:rPr>
-        <w:t>Synthwave</w:t>
-      </w:r>
-      <w:proofErr w:type="spellEnd"/>
-      <w:r>
-        <w:rPr>
-          <w:color w:val="000000"/>
-          <w:lang w:val="en-GB"/>
-        </w:rPr>
-        <w:t>. Cold tones, long pads. Three separate tracks, one per level, selected based on mood and thematic coherence with each sector. Music crossfades dynamically in response to game events and level progression.</w:t>
+        <w:t>Style: Dark Ambient / Minimal Synthwave. Cold tones, long pads. Three separate tracks, one per level, selected based on mood and thematic coherence with each sector. Music crossfades dynamically in response to game events and level progression.</w:t>
       </w:r>
     </w:p>
     <w:p>
@@ -16549,7 +16680,21 @@
           <w:color w:val="000000"/>
           <w:lang w:val="en-GB"/>
         </w:rPr>
-        <w:t>The TILT trigger logic is identical to the full design: TILT activates when an incompatible pair is detected on the same object. The return-to-source behaviour is permanent and implemented as designed. The visual feedback is a prototype simplification: a yellow warning material is applied to the object’s mesh for two seconds, accompanied by a camera shake and audio cue. The full game design specifies a HUD-based alert system as the primary feedback mechanism.</w:t>
+        <w:t xml:space="preserve">The TILT trigger logic is identical to the full design: TILT activates when an incompatible pair is detected on the same object. The </w:t>
+      </w:r>
+      <w:r>
+        <w:rPr>
+          <w:color w:val="000000"/>
+          <w:lang w:val="en-GB"/>
+        </w:rPr>
+        <w:t xml:space="preserve">clear of the Tag of the object </w:t>
+      </w:r>
+      <w:r>
+        <w:rPr>
+          <w:color w:val="000000"/>
+          <w:lang w:val="en-GB"/>
+        </w:rPr>
+        <w:t>behaviour is permanent and implemented as designed. The visual feedback is a prototype simplification: a yellow warning material is applied to the object’s mesh for two seconds, accompanied by a camera shake and audio cue. The full game design specifies a HUD-based alert system as the primary feedback mechanism.</w:t>
       </w:r>
     </w:p>
     <w:p>

</xml_diff>